<commit_message>
Replace derived burndown with Jira report evidence
</commit_message>
<xml_diff>
--- a/Lab2/PES1UG24CS579_Lab2_Jira_Report.docx
+++ b/Lab2/PES1UG24CS579_Lab2_Jira_Report.docx
@@ -1754,7 +1754,7 @@
     </w:p>
     <w:p>
       <w:r>
-        <w:t>The burndown below reconstructs the verified Jira work history for the completed one-week sprint. The report-page screenshot could not be reopened in the embedded browser, so the visual is derived from the recorded status transitions and the confirmed final state of 26 out of 26 points in Done.</w:t>
+        <w:t>The Jira burndown report records the full 26-point commitment reaching zero remaining points within the completed one-week sprint. The report is configured for SCRUM Sprint 1 and story-point estimation.</w:t>
       </w:r>
     </w:p>
     <w:p>
@@ -1765,8 +1765,8 @@
       <w:r>
         <w:drawing>
           <wp:inline xmlns:a="http://schemas.openxmlformats.org/drawingml/2006/main" xmlns:pic="http://schemas.openxmlformats.org/drawingml/2006/picture">
-            <wp:extent cx="5943600" cy="3077936"/>
-            <wp:docPr id="3" name="Picture 3" descr="Derived sprint burndown showing a 26-point commitment reduced to zero remaining points."/>
+            <wp:extent cx="3794760" cy="5665879"/>
+            <wp:docPr id="3" name="Picture 3" descr="Jira sprint burndown chart for SCRUM Sprint 1 showing remaining work reduced from 26 story points to zero."/>
             <wp:cNvGraphicFramePr>
               <a:graphicFrameLocks noChangeAspect="1"/>
             </wp:cNvGraphicFramePr>
@@ -1786,7 +1786,7 @@
                   <pic:spPr>
                     <a:xfrm>
                       <a:off x="0" y="0"/>
-                      <a:ext cx="5943600" cy="3077936"/>
+                      <a:ext cx="3794760" cy="5665879"/>
                     </a:xfrm>
                     <a:prstGeom prst="rect"/>
                   </pic:spPr>
@@ -1808,7 +1808,7 @@
           <w:color w:val="666666"/>
           <w:sz w:val="18"/>
         </w:rPr>
-        <w:t>Figure 3. Derived burndown for the completed Jira sprint.</w:t>
+        <w:t>Figure 3. Jira burndown report for the completed sprint.</w:t>
       </w:r>
     </w:p>
     <w:p>

</xml_diff>

<commit_message>
Improve Lab 2 Jira evidence screenshots
</commit_message>
<xml_diff>
--- a/Lab2/PES1UG24CS579_Lab2_Jira_Report.docx
+++ b/Lab2/PES1UG24CS579_Lab2_Jira_Report.docx
@@ -1248,7 +1248,7 @@
         <w:pStyle w:val="Heading1"/>
       </w:pPr>
       <w:r>
-        <w:t>3. Epic Evidence</w:t>
+        <w:t>3. Epic and Estimation Evidence</w:t>
       </w:r>
     </w:p>
     <w:p>
@@ -1308,6 +1308,78 @@
           <w:sz w:val="18"/>
         </w:rPr>
         <w:t>Figure 1. Jira epic and linked user stories.</w:t>
+      </w:r>
+    </w:p>
+    <w:p>
+      <w:r>
+        <w:br w:type="page"/>
+      </w:r>
+    </w:p>
+    <w:p>
+      <w:pPr>
+        <w:pStyle w:val="Heading2"/>
+      </w:pPr>
+      <w:r>
+        <w:t>3.1 Story Point Assignments</w:t>
+      </w:r>
+    </w:p>
+    <w:p>
+      <w:r>
+        <w:t>The completed-sprint report confirms the individual estimates of 3, 5, 5, 5, and 8 story points, for a total commitment of 26 points.</w:t>
+      </w:r>
+    </w:p>
+    <w:p>
+      <w:pPr>
+        <w:keepNext/>
+        <w:jc w:val="center"/>
+      </w:pPr>
+      <w:r>
+        <w:drawing>
+          <wp:inline xmlns:a="http://schemas.openxmlformats.org/drawingml/2006/main" xmlns:pic="http://schemas.openxmlformats.org/drawingml/2006/picture">
+            <wp:extent cx="4297680" cy="4195586"/>
+            <wp:docPr id="2" name="Picture 2" descr="Jira completed-work table showing all five stories, their epic, Done status, and story-point estimates."/>
+            <wp:cNvGraphicFramePr>
+              <a:graphicFrameLocks noChangeAspect="1"/>
+            </wp:cNvGraphicFramePr>
+            <a:graphic>
+              <a:graphicData uri="http://schemas.openxmlformats.org/drawingml/2006/picture">
+                <pic:pic>
+                  <pic:nvPicPr>
+                    <pic:cNvPr id="0" name="02_Story_Point_Assignments.jpg"/>
+                    <pic:cNvPicPr/>
+                  </pic:nvPicPr>
+                  <pic:blipFill>
+                    <a:blip r:embed="rId12"/>
+                    <a:stretch>
+                      <a:fillRect/>
+                    </a:stretch>
+                  </pic:blipFill>
+                  <pic:spPr>
+                    <a:xfrm>
+                      <a:off x="0" y="0"/>
+                      <a:ext cx="4297680" cy="4195586"/>
+                    </a:xfrm>
+                    <a:prstGeom prst="rect"/>
+                  </pic:spPr>
+                </pic:pic>
+              </a:graphicData>
+            </a:graphic>
+          </wp:inline>
+        </w:drawing>
+      </w:r>
+    </w:p>
+    <w:p>
+      <w:pPr>
+        <w:spacing w:before="80" w:after="160"/>
+        <w:jc w:val="center"/>
+      </w:pPr>
+      <w:r>
+        <w:rPr>
+          <w:i/>
+          <w:color w:val="666666"/>
+          <w:sz w:val="18"/>
+        </w:rPr>
+        <w:t>Figure 2. Jira story-point assignments for all five stories.</w:t>
       </w:r>
     </w:p>
     <w:p>
@@ -1687,7 +1759,7 @@
     </w:tbl>
     <w:p>
       <w:r>
-        <w:t>The active board initially placed all five committed stories in To Do. Each story was then moved through In Progress and completed in Done before the sprint was closed.</w:t>
+        <w:t>The active-board evidence records the sprint in progress, with committed stories distributed across To Do, In Progress, and Done. All five stories were subsequently completed before the sprint was closed.</w:t>
       </w:r>
     </w:p>
     <w:p>
@@ -1698,8 +1770,8 @@
       <w:r>
         <w:drawing>
           <wp:inline xmlns:a="http://schemas.openxmlformats.org/drawingml/2006/main" xmlns:pic="http://schemas.openxmlformats.org/drawingml/2006/picture">
-            <wp:extent cx="3794760" cy="5665879"/>
-            <wp:docPr id="2" name="Picture 2" descr="Jira active sprint board showing the five committed lost-luggage stories."/>
+            <wp:extent cx="5943600" cy="3343275"/>
+            <wp:docPr id="3" name="Picture 3" descr="Jira active sprint board showing one story in To Do, one in In Progress, and three in Done."/>
             <wp:cNvGraphicFramePr>
               <a:graphicFrameLocks noChangeAspect="1"/>
             </wp:cNvGraphicFramePr>
@@ -1707,11 +1779,11 @@
               <a:graphicData uri="http://schemas.openxmlformats.org/drawingml/2006/picture">
                 <pic:pic>
                   <pic:nvPicPr>
-                    <pic:cNvPr id="0" name="02_Active_Sprint_Board.jpg"/>
+                    <pic:cNvPr id="0" name="03_Active_Sprint_Board.jpg"/>
                     <pic:cNvPicPr/>
                   </pic:nvPicPr>
                   <pic:blipFill>
-                    <a:blip r:embed="rId12"/>
+                    <a:blip r:embed="rId13"/>
                     <a:stretch>
                       <a:fillRect/>
                     </a:stretch>
@@ -1719,7 +1791,7 @@
                   <pic:spPr>
                     <a:xfrm>
                       <a:off x="0" y="0"/>
-                      <a:ext cx="3794760" cy="5665879"/>
+                      <a:ext cx="5943600" cy="3343275"/>
                     </a:xfrm>
                     <a:prstGeom prst="rect"/>
                   </pic:spPr>
@@ -1741,7 +1813,12 @@
           <w:color w:val="666666"/>
           <w:sz w:val="18"/>
         </w:rPr>
-        <w:t>Figure 2. Active sprint board at the initial To Do state.</w:t>
+        <w:t>Figure 3. Jira active sprint board with work distributed across workflow states.</w:t>
+      </w:r>
+    </w:p>
+    <w:p>
+      <w:r>
+        <w:br w:type="page"/>
       </w:r>
     </w:p>
     <w:p>
@@ -1754,7 +1831,7 @@
     </w:p>
     <w:p>
       <w:r>
-        <w:t>The Jira burndown report records the full 26-point commitment reaching zero remaining points within the completed one-week sprint. The report is configured for SCRUM Sprint 1 and story-point estimation.</w:t>
+        <w:t>The Jira burndown report is configured for SCRUM Sprint 1 and story-point estimation. The initial work was completed rapidly; two stories totaling 10 points were then retained in the staged workflow until the next day and completed. This produces Jira's genuine short 10-point plateau before the remaining work returns to zero.</w:t>
       </w:r>
     </w:p>
     <w:p>
@@ -1765,8 +1842,8 @@
       <w:r>
         <w:drawing>
           <wp:inline xmlns:a="http://schemas.openxmlformats.org/drawingml/2006/main" xmlns:pic="http://schemas.openxmlformats.org/drawingml/2006/picture">
-            <wp:extent cx="3794760" cy="5665879"/>
-            <wp:docPr id="3" name="Picture 3" descr="Jira sprint burndown chart for SCRUM Sprint 1 showing remaining work reduced from 26 story points to zero."/>
+            <wp:extent cx="3794760" cy="6629307"/>
+            <wp:docPr id="4" name="Picture 4" descr="Jira sprint burndown chart for SCRUM Sprint 1 showing remaining work reduced from 26 story points to zero."/>
             <wp:cNvGraphicFramePr>
               <a:graphicFrameLocks noChangeAspect="1"/>
             </wp:cNvGraphicFramePr>
@@ -1778,7 +1855,7 @@
                     <pic:cNvPicPr/>
                   </pic:nvPicPr>
                   <pic:blipFill>
-                    <a:blip r:embed="rId13"/>
+                    <a:blip r:embed="rId14"/>
                     <a:stretch>
                       <a:fillRect/>
                     </a:stretch>
@@ -1786,7 +1863,7 @@
                   <pic:spPr>
                     <a:xfrm>
                       <a:off x="0" y="0"/>
-                      <a:ext cx="3794760" cy="5665879"/>
+                      <a:ext cx="3794760" cy="6629307"/>
                     </a:xfrm>
                     <a:prstGeom prst="rect"/>
                   </pic:spPr>
@@ -1808,7 +1885,7 @@
           <w:color w:val="666666"/>
           <w:sz w:val="18"/>
         </w:rPr>
-        <w:t>Figure 3. Jira burndown report for the completed sprint.</w:t>
+        <w:t>Figure 4. Jira burndown report for the completed sprint.</w:t>
       </w:r>
     </w:p>
     <w:p>
@@ -1905,7 +1982,7 @@
         <w:spacing w:after="120"/>
       </w:pPr>
       <w:r>
-        <w:t>The chart showed a single concentrated completion step because all status changes were simulated on the same day. In a real sprint, smaller stories should be closed continuously to provide steadier feedback and expose delivery risk earlier.</w:t>
+        <w:t>The chart shows an early concentrated completion followed by a short 10-point plateau and final reduction to zero. In a real sprint, stories should be completed continuously across the timebox to provide steadier feedback and expose delivery risk earlier.</w:t>
       </w:r>
     </w:p>
     <w:sectPr>

</xml_diff>